<commit_message>
Tema 3: chart the wayfinder map for replikacija and distribuirana konzistentnost
Scaffold the topic workspace from templates, write MISSION.md and NOTES.md,
set the title, and chart the map with 12 tickets. Resolve the six research
tickets in parallel at charting.

Key findings: no lecture deck backs this topic (05_Oporavak is R&G ch. 20 and
supplies 26 Serbian logging terms the binlog chapter can inherit);
AFTER_SYNC vs AFTER_COMMIT is the paper's sharpest argument; geo-distribution
is a section, not a chapter.
</commit_message>
<xml_diff>
--- a/Tema 1. - Obrada upita (query processing) u MySQL/rad.docx
+++ b/Tema 1. - Obrada upita (query processing) u MySQL/rad.docx
@@ -290,13 +290,7 @@
               <w:rPr>
                 <w:rFonts w:ascii="Times New Roman" w:hAnsi="Times New Roman"/>
               </w:rPr>
-              <w:t xml:space="preserve">                     </w:t>
-            </w:r>
-            <w:r>
-              <w:rPr>
-                <w:rFonts w:ascii="Times New Roman" w:hAnsi="Times New Roman"/>
-              </w:rPr>
-              <w:t>Mentor:</w:t>
+              <w:t xml:space="preserve">                     Mentor:</w:t>
             </w:r>
           </w:p>
         </w:tc>
@@ -333,13 +327,7 @@
               <w:rPr>
                 <w:rFonts w:ascii="Times New Roman" w:hAnsi="Times New Roman"/>
               </w:rPr>
-              <w:t xml:space="preserve">                     </w:t>
-            </w:r>
-            <w:r>
-              <w:rPr>
-                <w:rFonts w:ascii="Times New Roman" w:hAnsi="Times New Roman"/>
-              </w:rPr>
-              <w:t>Prof. dr Aleksandar Stanimirović</w:t>
+              <w:t xml:space="preserve">                     Prof. dr Aleksandar Stanimirović</w:t>
             </w:r>
           </w:p>
         </w:tc>
@@ -380,6 +368,12 @@
     </w:p>
     <w:sdt>
       <w:sdtPr>
+        <w:rPr>
+          <w:rFonts w:asciiTheme="minorHAnsi" w:eastAsiaTheme="minorEastAsia" w:hAnsiTheme="minorHAnsi" w:cstheme="minorBidi"/>
+          <w:color w:val="auto"/>
+          <w:sz w:val="24"/>
+          <w:szCs w:val="24"/>
+        </w:rPr>
         <w:id w:val="-663390182"/>
         <w:docPartObj>
           <w:docPartGallery w:val="Table of Contents"/>
@@ -388,13 +382,9 @@
       </w:sdtPr>
       <w:sdtEndPr>
         <w:rPr>
-          <w:rFonts w:asciiTheme="minorHAnsi" w:eastAsiaTheme="minorEastAsia" w:hAnsiTheme="minorHAnsi" w:cstheme="minorBidi"/>
           <w:b/>
           <w:bCs/>
           <w:noProof/>
-          <w:color w:val="auto"/>
-          <w:sz w:val="24"/>
-          <w:szCs w:val="24"/>
         </w:rPr>
       </w:sdtEndPr>
       <w:sdtContent>
@@ -2574,7 +2564,7 @@
                 <w:noProof/>
                 <w:webHidden/>
               </w:rPr>
-              <w:t>27</w:t>
+              <w:t>28</w:t>
             </w:r>
             <w:r>
               <w:rPr>
@@ -2601,13 +2591,13 @@
       <w:pPr>
         <w:pStyle w:val="Heading1"/>
       </w:pPr>
-      <w:bookmarkStart w:id="0" w:name="uvod"/>
-      <w:bookmarkStart w:id="1" w:name="_Toc239095739"/>
+      <w:bookmarkStart w:id="0" w:name="_Toc239095739"/>
+      <w:bookmarkStart w:id="1" w:name="uvod"/>
       <w:r>
         <w:lastRenderedPageBreak/>
         <w:t>1. Uvod</w:t>
       </w:r>
-      <w:bookmarkEnd w:id="1"/>
+      <w:bookmarkEnd w:id="0"/>
     </w:p>
     <w:p>
       <w:pPr>
@@ -2902,13 +2892,13 @@
       <w:pPr>
         <w:pStyle w:val="Heading1"/>
       </w:pPr>
-      <w:bookmarkStart w:id="2" w:name="arhitektura-obrade-upita-u-mysql-u"/>
-      <w:bookmarkStart w:id="3" w:name="_Toc239095740"/>
-      <w:bookmarkEnd w:id="0"/>
+      <w:bookmarkStart w:id="2" w:name="_Toc239095740"/>
+      <w:bookmarkStart w:id="3" w:name="arhitektura-obrade-upita-u-mysql-u"/>
+      <w:bookmarkEnd w:id="1"/>
       <w:r>
         <w:t>2. Arhitektura obrade upita u MySQL-u</w:t>
       </w:r>
-      <w:bookmarkEnd w:id="3"/>
+      <w:bookmarkEnd w:id="2"/>
     </w:p>
     <w:p>
       <w:pPr>
@@ -3445,13 +3435,13 @@
       <w:pPr>
         <w:pStyle w:val="Heading1"/>
       </w:pPr>
-      <w:bookmarkStart w:id="4" w:name="od-sql-a-do-plana-izvršavanja"/>
-      <w:bookmarkStart w:id="5" w:name="_Toc239095741"/>
-      <w:bookmarkEnd w:id="2"/>
+      <w:bookmarkStart w:id="4" w:name="_Toc239095741"/>
+      <w:bookmarkStart w:id="5" w:name="od-sql-a-do-plana-izvršavanja"/>
+      <w:bookmarkEnd w:id="3"/>
       <w:r>
         <w:t>3. Od SQL-a do plana izvršavanja</w:t>
       </w:r>
-      <w:bookmarkEnd w:id="5"/>
+      <w:bookmarkEnd w:id="4"/>
     </w:p>
     <w:p>
       <w:pPr>
@@ -3485,12 +3475,12 @@
       <w:pPr>
         <w:pStyle w:val="Heading2"/>
       </w:pPr>
-      <w:bookmarkStart w:id="6" w:name="pet-faza-obrade"/>
-      <w:bookmarkStart w:id="7" w:name="_Toc239095742"/>
+      <w:bookmarkStart w:id="6" w:name="_Toc239095742"/>
+      <w:bookmarkStart w:id="7" w:name="pet-faza-obrade"/>
       <w:r>
         <w:t>3.1. Pet faza obrade</w:t>
       </w:r>
-      <w:bookmarkEnd w:id="7"/>
+      <w:bookmarkEnd w:id="6"/>
     </w:p>
     <w:p>
       <w:pPr>
@@ -3681,13 +3671,13 @@
       <w:pPr>
         <w:pStyle w:val="Heading2"/>
       </w:pPr>
-      <w:bookmarkStart w:id="8" w:name="X32ffab066b839dcb4e0a49c8584e6a74a5e2558"/>
-      <w:bookmarkStart w:id="9" w:name="_Toc239095743"/>
-      <w:bookmarkEnd w:id="6"/>
+      <w:bookmarkStart w:id="8" w:name="_Toc239095743"/>
+      <w:bookmarkStart w:id="9" w:name="X32ffab066b839dcb4e0a49c8584e6a74a5e2558"/>
+      <w:bookmarkEnd w:id="7"/>
       <w:r>
         <w:t>3.2. Parser i razrešavanje: transformacije bez cene</w:t>
       </w:r>
-      <w:bookmarkEnd w:id="9"/>
+      <w:bookmarkEnd w:id="8"/>
     </w:p>
     <w:p>
       <w:pPr>
@@ -3802,104 +3792,104 @@
       <w:pPr>
         <w:pStyle w:val="Heading2"/>
       </w:pPr>
-      <w:bookmarkStart w:id="10" w:name="model-cene"/>
-      <w:bookmarkStart w:id="11" w:name="_Toc239095744"/>
-      <w:bookmarkEnd w:id="8"/>
+      <w:bookmarkStart w:id="10" w:name="_Toc239095744"/>
+      <w:bookmarkStart w:id="11" w:name="model-cene"/>
+      <w:bookmarkEnd w:id="9"/>
       <w:r>
         <w:t>3.3. Model cene</w:t>
       </w:r>
+      <w:bookmarkEnd w:id="10"/>
+    </w:p>
+    <w:p>
+      <w:pPr>
+        <w:pStyle w:val="FirstParagraph"/>
+      </w:pPr>
+      <w:r>
+        <w:t xml:space="preserve">Od granice cene nadalje svaka odluka sa alternativom razrešava se jednim brojem, pa vredi tačno znati šta je taj broj. Cena u MySQL-u nije ni vreme u sekundama ni ocena na nekoj skali, nego zbir nekoliko konstanti pomnoženih izmerenim veličinama. Te konstante nisu skrivene u kodu: nose ih dve obične tabele u bazi </w:t>
+      </w:r>
+      <w:r>
+        <w:rPr>
+          <w:rStyle w:val="VerbatimChar"/>
+        </w:rPr>
+        <w:t>mysql</w:t>
+      </w:r>
+      <w:r>
+        <w:t xml:space="preserve">, koje se čitaju običnim upitom i mogu se izmeniti [2]. Podela na dve tabele prati šav iz poglavlja 2: </w:t>
+      </w:r>
+      <w:r>
+        <w:rPr>
+          <w:rStyle w:val="VerbatimChar"/>
+        </w:rPr>
+        <w:t>server_cost</w:t>
+      </w:r>
+      <w:r>
+        <w:t xml:space="preserve"> sadrži serverske konstante (na primer </w:t>
+      </w:r>
+      <w:r>
+        <w:rPr>
+          <w:rStyle w:val="VerbatimChar"/>
+        </w:rPr>
+        <w:t>row_evaluate_cost</w:t>
+      </w:r>
+      <w:r>
+        <w:t xml:space="preserve"> = 0,1 po torki), a </w:t>
+      </w:r>
+      <w:r>
+        <w:rPr>
+          <w:rStyle w:val="VerbatimChar"/>
+        </w:rPr>
+        <w:t>engine_cost</w:t>
+      </w:r>
+      <w:r>
+        <w:t xml:space="preserve"> konstante po motoru (na primer </w:t>
+      </w:r>
+      <w:r>
+        <w:rPr>
+          <w:rStyle w:val="VerbatimChar"/>
+        </w:rPr>
+        <w:t>io_block_read_cost</w:t>
+      </w:r>
+      <w:r>
+        <w:t xml:space="preserve"> = 1,0 po pročitanoj stranici) [2].</w:t>
+      </w:r>
+    </w:p>
+    <w:p>
+      <w:pPr>
+        <w:pStyle w:val="BodyText"/>
+      </w:pPr>
+      <w:r>
+        <w:t xml:space="preserve">Zbog te strukture cena je proverljiva aritmetika. Cena skena tabele </w:t>
+      </w:r>
+      <w:r>
+        <w:rPr>
+          <w:rStyle w:val="VerbatimChar"/>
+        </w:rPr>
+        <w:t>wide_events</w:t>
+      </w:r>
+      <w:r>
+        <w:t xml:space="preserve"> sastavlja se kao zbir procesorskog dela (0,1 pomnoženo brojem torki) i ulazno-izlaznog dela (1,0 pomnoženo brojem stranica), što na tabeli od približno 4,9 miliona torki i 89.216 stranica daje cenu reda 580.000, upravo onu koju server i prijavljuje [2]. Jedan ulaz tog računa je stanje bafer pula: stranica koja je već u memoriji košta </w:t>
+      </w:r>
+      <w:r>
+        <w:rPr>
+          <w:rStyle w:val="VerbatimChar"/>
+        </w:rPr>
+        <w:t>memory_block_read_cost</w:t>
+      </w:r>
+      <w:r>
+        <w:t xml:space="preserve"> = 0,25 umesto 1,0, pa se ista cena razlikuje između dva pokretanja istog upita [2]. Ta zavisnost od trenutnog stanja memorije objašnjava zašto se u nastavku porede odnosi cena, a ne njihove apsolutne vrednosti.</w:t>
+      </w:r>
+    </w:p>
+    <w:p>
+      <w:pPr>
+        <w:pStyle w:val="Heading2"/>
+      </w:pPr>
+      <w:bookmarkStart w:id="12" w:name="_Toc239095745"/>
+      <w:bookmarkStart w:id="13" w:name="prva-odluka-po-ceni-pristupni-put"/>
       <w:bookmarkEnd w:id="11"/>
-    </w:p>
-    <w:p>
-      <w:pPr>
-        <w:pStyle w:val="FirstParagraph"/>
-      </w:pPr>
-      <w:r>
-        <w:t xml:space="preserve">Od granice cene nadalje svaka odluka sa alternativom razrešava se jednim brojem, pa vredi tačno znati šta je taj broj. Cena u MySQL-u nije ni vreme u sekundama ni ocena na nekoj skali, nego zbir nekoliko konstanti pomnoženih izmerenim veličinama. Te konstante nisu skrivene u kodu: nose ih dve obične tabele u bazi </w:t>
-      </w:r>
-      <w:r>
-        <w:rPr>
-          <w:rStyle w:val="VerbatimChar"/>
-        </w:rPr>
-        <w:t>mysql</w:t>
-      </w:r>
-      <w:r>
-        <w:t xml:space="preserve">, koje se čitaju običnim upitom i mogu se izmeniti [2]. Podela na dve tabele prati šav iz poglavlja 2: </w:t>
-      </w:r>
-      <w:r>
-        <w:rPr>
-          <w:rStyle w:val="VerbatimChar"/>
-        </w:rPr>
-        <w:t>server_cost</w:t>
-      </w:r>
-      <w:r>
-        <w:t xml:space="preserve"> sadrži serverske konstante (na primer </w:t>
-      </w:r>
-      <w:r>
-        <w:rPr>
-          <w:rStyle w:val="VerbatimChar"/>
-        </w:rPr>
-        <w:t>row_evaluate_cost</w:t>
-      </w:r>
-      <w:r>
-        <w:t xml:space="preserve"> = 0,1 po torki), a </w:t>
-      </w:r>
-      <w:r>
-        <w:rPr>
-          <w:rStyle w:val="VerbatimChar"/>
-        </w:rPr>
-        <w:t>engine_cost</w:t>
-      </w:r>
-      <w:r>
-        <w:t xml:space="preserve"> konstante po motoru (na primer </w:t>
-      </w:r>
-      <w:r>
-        <w:rPr>
-          <w:rStyle w:val="VerbatimChar"/>
-        </w:rPr>
-        <w:t>io_block_read_cost</w:t>
-      </w:r>
-      <w:r>
-        <w:t xml:space="preserve"> = 1,0 po pročitanoj stranici) [2].</w:t>
-      </w:r>
-    </w:p>
-    <w:p>
-      <w:pPr>
-        <w:pStyle w:val="BodyText"/>
-      </w:pPr>
-      <w:r>
-        <w:t xml:space="preserve">Zbog te strukture cena je proverljiva aritmetika. Cena skena tabele </w:t>
-      </w:r>
-      <w:r>
-        <w:rPr>
-          <w:rStyle w:val="VerbatimChar"/>
-        </w:rPr>
-        <w:t>wide_events</w:t>
-      </w:r>
-      <w:r>
-        <w:t xml:space="preserve"> sastavlja se kao zbir procesorskog dela (0,1 pomnoženo brojem torki) i ulazno-izlaznog dela (1,0 pomnoženo brojem stranica), što na tabeli od približno 4,9 miliona torki i 89.216 stranica daje cenu reda 580.000, upravo onu koju server i prijavljuje [2]. Jedan ulaz tog računa je stanje bafer pula: stranica koja je već u memoriji košta </w:t>
-      </w:r>
-      <w:r>
-        <w:rPr>
-          <w:rStyle w:val="VerbatimChar"/>
-        </w:rPr>
-        <w:t>memory_block_read_cost</w:t>
-      </w:r>
-      <w:r>
-        <w:t xml:space="preserve"> = 0,25 umesto 1,0, pa se ista cena razlikuje između dva pokretanja istog upita [2]. Ta zavisnost od trenutnog stanja memorije objašnjava zašto se u nastavku porede odnosi cena, a ne njihove apsolutne vrednosti.</w:t>
-      </w:r>
-    </w:p>
-    <w:p>
-      <w:pPr>
-        <w:pStyle w:val="Heading2"/>
-      </w:pPr>
-      <w:bookmarkStart w:id="12" w:name="prva-odluka-po-ceni-pristupni-put"/>
-      <w:bookmarkStart w:id="13" w:name="_Toc239095745"/>
-      <w:bookmarkEnd w:id="10"/>
       <w:r>
         <w:t>3.4. Prva odluka po ceni: pristupni put</w:t>
       </w:r>
-      <w:bookmarkEnd w:id="13"/>
+      <w:bookmarkEnd w:id="12"/>
     </w:p>
     <w:p>
       <w:pPr>
@@ -4018,13 +4008,13 @@
       <w:pPr>
         <w:pStyle w:val="Heading2"/>
       </w:pPr>
-      <w:bookmarkStart w:id="14" w:name="druga-odluka-po-ceni-redosled-spoja"/>
-      <w:bookmarkStart w:id="15" w:name="_Toc239095746"/>
-      <w:bookmarkEnd w:id="12"/>
+      <w:bookmarkStart w:id="14" w:name="_Toc239095746"/>
+      <w:bookmarkStart w:id="15" w:name="druga-odluka-po-ceni-redosled-spoja"/>
+      <w:bookmarkEnd w:id="13"/>
       <w:r>
         <w:t>3.5. Druga odluka po ceni: redosled spoja</w:t>
       </w:r>
-      <w:bookmarkEnd w:id="15"/>
+      <w:bookmarkEnd w:id="14"/>
     </w:p>
     <w:p>
       <w:pPr>
@@ -4114,13 +4104,13 @@
       <w:pPr>
         <w:pStyle w:val="Heading2"/>
       </w:pPr>
-      <w:bookmarkStart w:id="16" w:name="šta-je-ostavljeno-za-naredna-poglavlja"/>
-      <w:bookmarkStart w:id="17" w:name="_Toc239095747"/>
-      <w:bookmarkEnd w:id="14"/>
+      <w:bookmarkStart w:id="16" w:name="_Toc239095747"/>
+      <w:bookmarkStart w:id="17" w:name="šta-je-ostavljeno-za-naredna-poglavlja"/>
+      <w:bookmarkEnd w:id="15"/>
       <w:r>
         <w:t>3.6. Šta je ostavljeno za naredna poglavlja</w:t>
       </w:r>
-      <w:bookmarkEnd w:id="17"/>
+      <w:bookmarkEnd w:id="16"/>
     </w:p>
     <w:p>
       <w:pPr>
@@ -4162,14 +4152,14 @@
       <w:pPr>
         <w:pStyle w:val="Heading1"/>
       </w:pPr>
-      <w:bookmarkStart w:id="18" w:name="explain-i-explain-analyze"/>
-      <w:bookmarkStart w:id="19" w:name="_Toc239095748"/>
-      <w:bookmarkEnd w:id="4"/>
-      <w:bookmarkEnd w:id="16"/>
+      <w:bookmarkStart w:id="18" w:name="_Toc239095748"/>
+      <w:bookmarkStart w:id="19" w:name="explain-i-explain-analyze"/>
+      <w:bookmarkEnd w:id="5"/>
+      <w:bookmarkEnd w:id="17"/>
       <w:r>
         <w:t>4. EXPLAIN i EXPLAIN ANALYZE</w:t>
       </w:r>
-      <w:bookmarkEnd w:id="19"/>
+      <w:bookmarkEnd w:id="18"/>
     </w:p>
     <w:p>
       <w:pPr>
@@ -4255,12 +4245,12 @@
       <w:pPr>
         <w:pStyle w:val="Heading2"/>
       </w:pPr>
-      <w:bookmarkStart w:id="20" w:name="tri-formata-ispisa-dva-oblika-plana"/>
-      <w:bookmarkStart w:id="21" w:name="_Toc239095749"/>
+      <w:bookmarkStart w:id="20" w:name="_Toc239095749"/>
+      <w:bookmarkStart w:id="21" w:name="tri-formata-ispisa-dva-oblika-plana"/>
       <w:r>
         <w:t>4.1. Tri formata ispisa, dva oblika plana</w:t>
       </w:r>
-      <w:bookmarkEnd w:id="21"/>
+      <w:bookmarkEnd w:id="20"/>
     </w:p>
     <w:p>
       <w:pPr>
@@ -4564,13 +4554,13 @@
       <w:pPr>
         <w:pStyle w:val="Heading2"/>
       </w:pPr>
-      <w:bookmarkStart w:id="22" w:name="kolone-koje-nose-odluku"/>
-      <w:bookmarkStart w:id="23" w:name="_Toc239095750"/>
-      <w:bookmarkEnd w:id="20"/>
+      <w:bookmarkStart w:id="22" w:name="_Toc239095750"/>
+      <w:bookmarkStart w:id="23" w:name="kolone-koje-nose-odluku"/>
+      <w:bookmarkEnd w:id="21"/>
       <w:r>
         <w:t>4.2. Kolone koje nose odluku</w:t>
       </w:r>
-      <w:bookmarkEnd w:id="23"/>
+      <w:bookmarkEnd w:id="22"/>
     </w:p>
     <w:p>
       <w:pPr>
@@ -4898,13 +4888,13 @@
       <w:pPr>
         <w:pStyle w:val="Heading2"/>
       </w:pPr>
-      <w:bookmarkStart w:id="24" w:name="lestvica-tipova-pristupa"/>
-      <w:bookmarkStart w:id="25" w:name="_Toc239095751"/>
-      <w:bookmarkEnd w:id="22"/>
+      <w:bookmarkStart w:id="24" w:name="_Toc239095751"/>
+      <w:bookmarkStart w:id="25" w:name="lestvica-tipova-pristupa"/>
+      <w:bookmarkEnd w:id="23"/>
       <w:r>
         <w:t>4.3. Lestvica tipova pristupa</w:t>
       </w:r>
-      <w:bookmarkEnd w:id="25"/>
+      <w:bookmarkEnd w:id="24"/>
     </w:p>
     <w:p>
       <w:pPr>
@@ -5276,9 +5266,9 @@
       <w:pPr>
         <w:pStyle w:val="Heading2"/>
       </w:pPr>
-      <w:bookmarkStart w:id="26" w:name="kolona-extra-i-granica-procene"/>
-      <w:bookmarkStart w:id="27" w:name="_Toc239095752"/>
-      <w:bookmarkEnd w:id="24"/>
+      <w:bookmarkStart w:id="26" w:name="_Toc239095752"/>
+      <w:bookmarkStart w:id="27" w:name="kolona-extra-i-granica-procene"/>
+      <w:bookmarkEnd w:id="25"/>
       <w:r>
         <w:t xml:space="preserve">4.4. Kolona </w:t>
       </w:r>
@@ -5291,7 +5281,7 @@
       <w:r>
         <w:t xml:space="preserve"> i granica procene</w:t>
       </w:r>
-      <w:bookmarkEnd w:id="27"/>
+      <w:bookmarkEnd w:id="26"/>
     </w:p>
     <w:p>
       <w:pPr>
@@ -5457,13 +5447,13 @@
       <w:pPr>
         <w:pStyle w:val="Heading2"/>
       </w:pPr>
-      <w:bookmarkStart w:id="28" w:name="merenje-umesto-procene"/>
-      <w:bookmarkStart w:id="29" w:name="_Toc239095753"/>
-      <w:bookmarkEnd w:id="26"/>
+      <w:bookmarkStart w:id="28" w:name="_Toc239095753"/>
+      <w:bookmarkStart w:id="29" w:name="merenje-umesto-procene"/>
+      <w:bookmarkEnd w:id="27"/>
       <w:r>
         <w:t>4.5. Merenje umesto procene</w:t>
       </w:r>
-      <w:bookmarkEnd w:id="29"/>
+      <w:bookmarkEnd w:id="28"/>
     </w:p>
     <w:p>
       <w:pPr>
@@ -5853,13 +5843,13 @@
       <w:pPr>
         <w:pStyle w:val="Heading2"/>
       </w:pPr>
-      <w:bookmarkStart w:id="30" w:name="prosek-po-ponavljanju"/>
-      <w:bookmarkStart w:id="31" w:name="_Toc239095754"/>
-      <w:bookmarkEnd w:id="28"/>
+      <w:bookmarkStart w:id="30" w:name="_Toc239095754"/>
+      <w:bookmarkStart w:id="31" w:name="prosek-po-ponavljanju"/>
+      <w:bookmarkEnd w:id="29"/>
       <w:r>
         <w:t>4.6. Prosek po ponavljanju</w:t>
       </w:r>
-      <w:bookmarkEnd w:id="31"/>
+      <w:bookmarkEnd w:id="30"/>
     </w:p>
     <w:p>
       <w:pPr>
@@ -6022,14 +6012,14 @@
       <w:pPr>
         <w:pStyle w:val="Heading2"/>
       </w:pPr>
-      <w:bookmarkStart w:id="32" w:name="plan-koji-ispis-prikazuje-kao-savršen"/>
-      <w:bookmarkStart w:id="33" w:name="_Toc239095755"/>
-      <w:bookmarkEnd w:id="30"/>
+      <w:bookmarkStart w:id="32" w:name="_Toc239095755"/>
+      <w:bookmarkStart w:id="33" w:name="plan-koji-ispis-prikazuje-kao-savršen"/>
+      <w:bookmarkEnd w:id="31"/>
       <w:r>
         <w:lastRenderedPageBreak/>
         <w:t>4.7. Plan koji ispis prikazuje kao savršen</w:t>
       </w:r>
-      <w:bookmarkEnd w:id="33"/>
+      <w:bookmarkEnd w:id="32"/>
     </w:p>
     <w:p>
       <w:pPr>
@@ -6312,13 +6302,13 @@
       <w:pPr>
         <w:pStyle w:val="Heading2"/>
       </w:pPr>
-      <w:bookmarkStart w:id="34" w:name="Xf54737ac2ca808dde4a0a0415c363beba978eac"/>
-      <w:bookmarkStart w:id="35" w:name="_Toc239095756"/>
-      <w:bookmarkEnd w:id="32"/>
+      <w:bookmarkStart w:id="34" w:name="_Toc239095756"/>
+      <w:bookmarkStart w:id="35" w:name="Xf54737ac2ca808dde4a0a0415c363beba978eac"/>
+      <w:bookmarkEnd w:id="33"/>
       <w:r>
         <w:t>4.8. Trag optimizatora: odbačeni planovi i njihova cena</w:t>
       </w:r>
-      <w:bookmarkEnd w:id="35"/>
+      <w:bookmarkEnd w:id="34"/>
     </w:p>
     <w:p>
       <w:pPr>
@@ -6778,13 +6768,13 @@
       <w:pPr>
         <w:pStyle w:val="Heading2"/>
       </w:pPr>
-      <w:bookmarkStart w:id="36" w:name="plan-tuđe-sesije-explain-for-connection"/>
-      <w:bookmarkStart w:id="37" w:name="_Toc239095757"/>
-      <w:bookmarkEnd w:id="34"/>
+      <w:bookmarkStart w:id="36" w:name="_Toc239095757"/>
+      <w:bookmarkStart w:id="37" w:name="plan-tuđe-sesije-explain-for-connection"/>
+      <w:bookmarkEnd w:id="35"/>
       <w:r>
         <w:t>4.9. Plan tuđe sesije: EXPLAIN FOR CONNECTION</w:t>
       </w:r>
-      <w:bookmarkEnd w:id="37"/>
+      <w:bookmarkEnd w:id="36"/>
     </w:p>
     <w:p>
       <w:pPr>
@@ -6856,14 +6846,14 @@
       <w:pPr>
         <w:pStyle w:val="Heading1"/>
       </w:pPr>
-      <w:bookmarkStart w:id="38" w:name="iterator-model-i-pipeline-operatora"/>
-      <w:bookmarkStart w:id="39" w:name="_Toc239095758"/>
-      <w:bookmarkEnd w:id="18"/>
-      <w:bookmarkEnd w:id="36"/>
+      <w:bookmarkStart w:id="38" w:name="_Toc239095758"/>
+      <w:bookmarkStart w:id="39" w:name="iterator-model-i-pipeline-operatora"/>
+      <w:bookmarkEnd w:id="19"/>
+      <w:bookmarkEnd w:id="37"/>
       <w:r>
         <w:t>5. Iterator model i pipeline operatora</w:t>
       </w:r>
-      <w:bookmarkEnd w:id="39"/>
+      <w:bookmarkEnd w:id="38"/>
     </w:p>
     <w:p>
       <w:pPr>
@@ -6904,12 +6894,12 @@
       <w:pPr>
         <w:pStyle w:val="Heading2"/>
       </w:pPr>
-      <w:bookmarkStart w:id="40" w:name="iterator-objekat-sa-tri-metode"/>
-      <w:bookmarkStart w:id="41" w:name="_Toc239095759"/>
+      <w:bookmarkStart w:id="40" w:name="_Toc239095759"/>
+      <w:bookmarkStart w:id="41" w:name="iterator-objekat-sa-tri-metode"/>
       <w:r>
         <w:t>5.1. Iterator: objekat sa tri metode</w:t>
       </w:r>
-      <w:bookmarkEnd w:id="41"/>
+      <w:bookmarkEnd w:id="40"/>
     </w:p>
     <w:p>
       <w:pPr>
@@ -7066,13 +7056,13 @@
       <w:pPr>
         <w:pStyle w:val="Heading2"/>
       </w:pPr>
-      <w:bookmarkStart w:id="42" w:name="stablo-iteratora-u-ispisu-formattree"/>
-      <w:bookmarkStart w:id="43" w:name="_Toc239095760"/>
-      <w:bookmarkEnd w:id="40"/>
+      <w:bookmarkStart w:id="42" w:name="_Toc239095760"/>
+      <w:bookmarkStart w:id="43" w:name="stablo-iteratora-u-ispisu-formattree"/>
+      <w:bookmarkEnd w:id="41"/>
       <w:r>
         <w:t>5.2. Stablo iteratora u ispisu FORMAT=TREE</w:t>
       </w:r>
-      <w:bookmarkEnd w:id="43"/>
+      <w:bookmarkEnd w:id="42"/>
     </w:p>
     <w:p>
       <w:pPr>
@@ -7488,9 +7478,9 @@
       <w:pPr>
         <w:pStyle w:val="Heading2"/>
       </w:pPr>
-      <w:bookmarkStart w:id="44" w:name="Xec7235ad9e52edda03f9d42326cbf7f91934408"/>
-      <w:bookmarkStart w:id="45" w:name="_Toc239095761"/>
-      <w:bookmarkEnd w:id="42"/>
+      <w:bookmarkStart w:id="44" w:name="_Toc239095761"/>
+      <w:bookmarkStart w:id="45" w:name="Xec7235ad9e52edda03f9d42326cbf7f91934408"/>
+      <w:bookmarkEnd w:id="43"/>
       <w:r>
         <w:t xml:space="preserve">5.3. Vrednost </w:t>
       </w:r>
@@ -7509,153 +7499,153 @@
         </w:rPr>
         <w:t>Init()</w:t>
       </w:r>
+      <w:bookmarkEnd w:id="44"/>
+    </w:p>
+    <w:p>
+      <w:pPr>
+        <w:pStyle w:val="FirstParagraph"/>
+      </w:pPr>
+      <w:r>
+        <w:t xml:space="preserve">Odeljak 4.6 uveo je </w:t>
+      </w:r>
+      <w:r>
+        <w:rPr>
+          <w:rStyle w:val="VerbatimChar"/>
+        </w:rPr>
+        <w:t>loops</w:t>
+      </w:r>
+      <w:r>
+        <w:t xml:space="preserve"> kao broj ponavljanja čvora i tu se zaustavio. Izvorni kod kaže šta se tačno broji: metoda </w:t>
+      </w:r>
+      <w:r>
+        <w:rPr>
+          <w:rStyle w:val="VerbatimChar"/>
+        </w:rPr>
+        <w:t>GetNumInitCalls()</w:t>
+      </w:r>
+      <w:r>
+        <w:t xml:space="preserve"> klase </w:t>
+      </w:r>
+      <w:r>
+        <w:rPr>
+          <w:rStyle w:val="VerbatimChar"/>
+        </w:rPr>
+        <w:t>IteratorProfiler</w:t>
+      </w:r>
+      <w:r>
+        <w:t xml:space="preserve">, koja postoji zato da bi naredba </w:t>
+      </w:r>
+      <w:r>
+        <w:rPr>
+          <w:rStyle w:val="VerbatimChar"/>
+        </w:rPr>
+        <w:t>EXPLAIN ANALYZE</w:t>
+      </w:r>
+      <w:r>
+        <w:t xml:space="preserve"> imala odakle da čita, vraća broj poziva metode </w:t>
+      </w:r>
+      <w:r>
+        <w:rPr>
+          <w:rStyle w:val="VerbatimChar"/>
+        </w:rPr>
+        <w:t>Init()</w:t>
+      </w:r>
+      <w:r>
+        <w:t xml:space="preserve"> nad tim iteratorom [3].</w:t>
+      </w:r>
+    </w:p>
+    <w:p>
+      <w:pPr>
+        <w:pStyle w:val="BodyText"/>
+      </w:pPr>
+      <w:r>
+        <w:t xml:space="preserve">Time dva pravila iz poglavlja 4 postaju posledice, a ne konvencije ispisa. Prvo, </w:t>
+      </w:r>
+      <w:r>
+        <w:rPr>
+          <w:rStyle w:val="VerbatimChar"/>
+        </w:rPr>
+        <w:t>NestedLoopIterator</w:t>
+      </w:r>
+      <w:r>
+        <w:t xml:space="preserve"> za svaku torku spoljašnjeg ulaza pozove </w:t>
+      </w:r>
+      <w:r>
+        <w:rPr>
+          <w:rStyle w:val="VerbatimChar"/>
+        </w:rPr>
+        <w:t>Init()</w:t>
+      </w:r>
+      <w:r>
+        <w:t xml:space="preserve"> pa </w:t>
+      </w:r>
+      <w:r>
+        <w:rPr>
+          <w:rStyle w:val="VerbatimChar"/>
+        </w:rPr>
+        <w:t>Read()</w:t>
+      </w:r>
+      <w:r>
+        <w:t xml:space="preserve"> na unutrašnjem ulazu, pa je </w:t>
+      </w:r>
+      <w:r>
+        <w:rPr>
+          <w:rStyle w:val="VerbatimChar"/>
+        </w:rPr>
+        <w:t>loops</w:t>
+      </w:r>
+      <w:r>
+        <w:t xml:space="preserve"> na unutrašnjem čvoru jednak broju torki koje je izbacio spoljašnji čvor: u navedenom upitu to je 584, tačno onoliko koliko u tabeli </w:t>
+      </w:r>
+      <w:r>
+        <w:rPr>
+          <w:rStyle w:val="VerbatimChar"/>
+        </w:rPr>
+        <w:t>customer</w:t>
+      </w:r>
+      <w:r>
+        <w:t xml:space="preserve"> ima aktivnih kupaca. Drugo, pošto se merenja sabiraju kroz sva ponavljanja a prikazuju po jednom ponavljanju, </w:t>
+      </w:r>
+      <w:r>
+        <w:rPr>
+          <w:rStyle w:val="VerbatimChar"/>
+        </w:rPr>
+        <w:t>rows</w:t>
+      </w:r>
+      <w:r>
+        <w:t xml:space="preserve"> na unutrašnjem čvoru je prosek po ponavljanju i zato sme da bude decimalan broj. Ukupan broj torki dobija se množenjem: prijavljeno </w:t>
+      </w:r>
+      <w:r>
+        <w:rPr>
+          <w:rStyle w:val="VerbatimChar"/>
+        </w:rPr>
+        <w:t>rows=26.8</w:t>
+      </w:r>
+      <w:r>
+        <w:t xml:space="preserve"> puta </w:t>
+      </w:r>
+      <w:r>
+        <w:rPr>
+          <w:rStyle w:val="VerbatimChar"/>
+        </w:rPr>
+        <w:t>loops=584</w:t>
+      </w:r>
+      <w:r>
+        <w:t xml:space="preserve"> daje približno 15.651, prema 15.640 koliko prijavljuje sam čvor spoja, a razlika potiče od zaokruživanja ispisane vrednosti.</w:t>
+      </w:r>
+    </w:p>
+    <w:p>
+      <w:pPr>
+        <w:pStyle w:val="Heading2"/>
+      </w:pPr>
+      <w:bookmarkStart w:id="46" w:name="_Toc239095762"/>
+      <w:bookmarkStart w:id="47" w:name="pipeline-i-blokirajući-operatori"/>
       <w:bookmarkEnd w:id="45"/>
-    </w:p>
-    <w:p>
-      <w:pPr>
-        <w:pStyle w:val="FirstParagraph"/>
-      </w:pPr>
-      <w:r>
-        <w:t xml:space="preserve">Odeljak 4.6 uveo je </w:t>
-      </w:r>
-      <w:r>
-        <w:rPr>
-          <w:rStyle w:val="VerbatimChar"/>
-        </w:rPr>
-        <w:t>loops</w:t>
-      </w:r>
-      <w:r>
-        <w:t xml:space="preserve"> kao broj ponavljanja čvora i tu se zaustavio. Izvorni kod kaže šta se tačno broji: metoda </w:t>
-      </w:r>
-      <w:r>
-        <w:rPr>
-          <w:rStyle w:val="VerbatimChar"/>
-        </w:rPr>
-        <w:t>GetNumInitCalls()</w:t>
-      </w:r>
-      <w:r>
-        <w:t xml:space="preserve"> klase </w:t>
-      </w:r>
-      <w:r>
-        <w:rPr>
-          <w:rStyle w:val="VerbatimChar"/>
-        </w:rPr>
-        <w:t>IteratorProfiler</w:t>
-      </w:r>
-      <w:r>
-        <w:t xml:space="preserve">, koja postoji zato da bi naredba </w:t>
-      </w:r>
-      <w:r>
-        <w:rPr>
-          <w:rStyle w:val="VerbatimChar"/>
-        </w:rPr>
-        <w:t>EXPLAIN ANALYZE</w:t>
-      </w:r>
-      <w:r>
-        <w:t xml:space="preserve"> imala odakle da čita, vraća broj poziva metode </w:t>
-      </w:r>
-      <w:r>
-        <w:rPr>
-          <w:rStyle w:val="VerbatimChar"/>
-        </w:rPr>
-        <w:t>Init()</w:t>
-      </w:r>
-      <w:r>
-        <w:t xml:space="preserve"> nad tim iteratorom [3].</w:t>
-      </w:r>
-    </w:p>
-    <w:p>
-      <w:pPr>
-        <w:pStyle w:val="BodyText"/>
-      </w:pPr>
-      <w:r>
-        <w:t xml:space="preserve">Time dva pravila iz poglavlja 4 postaju posledice, a ne konvencije ispisa. Prvo, </w:t>
-      </w:r>
-      <w:r>
-        <w:rPr>
-          <w:rStyle w:val="VerbatimChar"/>
-        </w:rPr>
-        <w:t>NestedLoopIterator</w:t>
-      </w:r>
-      <w:r>
-        <w:t xml:space="preserve"> za svaku torku spoljašnjeg ulaza pozove </w:t>
-      </w:r>
-      <w:r>
-        <w:rPr>
-          <w:rStyle w:val="VerbatimChar"/>
-        </w:rPr>
-        <w:t>Init()</w:t>
-      </w:r>
-      <w:r>
-        <w:t xml:space="preserve"> pa </w:t>
-      </w:r>
-      <w:r>
-        <w:rPr>
-          <w:rStyle w:val="VerbatimChar"/>
-        </w:rPr>
-        <w:t>Read()</w:t>
-      </w:r>
-      <w:r>
-        <w:t xml:space="preserve"> na unutrašnjem ulazu, pa je </w:t>
-      </w:r>
-      <w:r>
-        <w:rPr>
-          <w:rStyle w:val="VerbatimChar"/>
-        </w:rPr>
-        <w:t>loops</w:t>
-      </w:r>
-      <w:r>
-        <w:t xml:space="preserve"> na unutrašnjem čvoru jednak broju torki koje je izbacio spoljašnji čvor: u navedenom upitu to je 584, tačno onoliko koliko u tabeli </w:t>
-      </w:r>
-      <w:r>
-        <w:rPr>
-          <w:rStyle w:val="VerbatimChar"/>
-        </w:rPr>
-        <w:t>customer</w:t>
-      </w:r>
-      <w:r>
-        <w:t xml:space="preserve"> ima aktivnih kupaca. Drugo, pošto se merenja sabiraju kroz sva ponavljanja a prikazuju po jednom ponavljanju, </w:t>
-      </w:r>
-      <w:r>
-        <w:rPr>
-          <w:rStyle w:val="VerbatimChar"/>
-        </w:rPr>
-        <w:t>rows</w:t>
-      </w:r>
-      <w:r>
-        <w:t xml:space="preserve"> na unutrašnjem čvoru je prosek po ponavljanju i zato sme da bude decimalan broj. Ukupan broj torki dobija se množenjem: prijavljeno </w:t>
-      </w:r>
-      <w:r>
-        <w:rPr>
-          <w:rStyle w:val="VerbatimChar"/>
-        </w:rPr>
-        <w:t>rows=26.8</w:t>
-      </w:r>
-      <w:r>
-        <w:t xml:space="preserve"> puta </w:t>
-      </w:r>
-      <w:r>
-        <w:rPr>
-          <w:rStyle w:val="VerbatimChar"/>
-        </w:rPr>
-        <w:t>loops=584</w:t>
-      </w:r>
-      <w:r>
-        <w:t xml:space="preserve"> daje približno 15.651, prema 15.640 koliko prijavljuje sam čvor spoja, a razlika potiče od zaokruživanja ispisane vrednosti.</w:t>
-      </w:r>
-    </w:p>
-    <w:p>
-      <w:pPr>
-        <w:pStyle w:val="Heading2"/>
-      </w:pPr>
-      <w:bookmarkStart w:id="46" w:name="pipeline-i-blokirajući-operatori"/>
-      <w:bookmarkStart w:id="47" w:name="_Toc239095762"/>
-      <w:bookmarkEnd w:id="44"/>
       <w:r>
         <w:lastRenderedPageBreak/>
         <w:t>5.4. Pipeline i blokirajući operatori</w:t>
       </w:r>
-      <w:bookmarkEnd w:id="47"/>
+      <w:bookmarkEnd w:id="46"/>
     </w:p>
     <w:p>
       <w:pPr>
@@ -7944,9 +7934,9 @@
       <w:pPr>
         <w:pStyle w:val="Heading2"/>
       </w:pPr>
-      <w:bookmarkStart w:id="48" w:name="X2c2d29d51e814dcd918ff6fc6231d08491b5417"/>
-      <w:bookmarkStart w:id="49" w:name="_Toc239095763"/>
-      <w:bookmarkEnd w:id="46"/>
+      <w:bookmarkStart w:id="48" w:name="_Toc239095763"/>
+      <w:bookmarkStart w:id="49" w:name="X2c2d29d51e814dcd918ff6fc6231d08491b5417"/>
+      <w:bookmarkEnd w:id="47"/>
       <w:r>
         <w:lastRenderedPageBreak/>
         <w:t xml:space="preserve">5.5. Struktura </w:t>
@@ -7960,122 +7950,122 @@
       <w:r>
         <w:t xml:space="preserve"> je plan, iterator je izvršavanje</w:t>
       </w:r>
+      <w:bookmarkEnd w:id="48"/>
+    </w:p>
+    <w:p>
+      <w:pPr>
+        <w:pStyle w:val="FirstParagraph"/>
+      </w:pPr>
+      <w:r>
+        <w:t xml:space="preserve">Ostaje pitanje odakle iteratori dolaze. Između planera iz poglavlja 3 i izvršioca stoji struktura </w:t>
+      </w:r>
+      <w:r>
+        <w:rPr>
+          <w:rStyle w:val="VerbatimChar"/>
+        </w:rPr>
+        <w:t>AccessPath</w:t>
+      </w:r>
+      <w:r>
+        <w:t xml:space="preserve">, koju izvorni kod opisuje kao strukturu planiranja upita koja iteratorima odgovara jedan prema jedan, jer sadrži gotovo tačno ono što je potrebno da se odgovarajući iterator instancira, uz podatke koji su potrebni samo tokom planiranja, kao što je cena [3]. Optimizator, dakle, ne pravi iteratore nego stablo struktura </w:t>
+      </w:r>
+      <w:r>
+        <w:rPr>
+          <w:rStyle w:val="VerbatimChar"/>
+        </w:rPr>
+        <w:t>AccessPath</w:t>
+      </w:r>
+      <w:r>
+        <w:t xml:space="preserve">, namerno malih i fiksne veličine, kako bi tokom pretrage jedna mogla da se zameni boljom bez nove alokacije; tek na kraju funkcija </w:t>
+      </w:r>
+      <w:r>
+        <w:rPr>
+          <w:rStyle w:val="VerbatimChar"/>
+        </w:rPr>
+        <w:t>CreateIteratorFromAccessPath()</w:t>
+      </w:r>
+      <w:r>
+        <w:t xml:space="preserve"> to stablo prevodi u stablo iteratora [3]. Strukturu </w:t>
+      </w:r>
+      <w:r>
+        <w:rPr>
+          <w:rStyle w:val="VerbatimChar"/>
+        </w:rPr>
+        <w:t>AccessPath</w:t>
+      </w:r>
+      <w:r>
+        <w:t xml:space="preserve"> ne treba mešati sa pristupnim putem iz poglavlja 1 i 3: prva je konkretna struktura u kodu, a drugi je pojam koji označava način na koji se dolazi do torki jedne tabele.</w:t>
+      </w:r>
+    </w:p>
+    <w:p>
+      <w:pPr>
+        <w:pStyle w:val="BodyText"/>
+      </w:pPr>
+      <w:r>
+        <w:t xml:space="preserve">Time se zatvara i pitanje otvoreno u odeljku 4.8, gde je u tragu optimizatora sav sadržaj bio u fazi </w:t>
+      </w:r>
+      <w:r>
+        <w:rPr>
+          <w:rStyle w:val="VerbatimChar"/>
+        </w:rPr>
+        <w:t>join_optimization</w:t>
+      </w:r>
+      <w:r>
+        <w:t xml:space="preserve">, dok je faza </w:t>
+      </w:r>
+      <w:r>
+        <w:rPr>
+          <w:rStyle w:val="VerbatimChar"/>
+        </w:rPr>
+        <w:t>join_execution</w:t>
+      </w:r>
+      <w:r>
+        <w:t xml:space="preserve"> bila prazna. Razlog je što se u izvršavanju ne donosi nijedna odluka koju bi trag imao da zabeleži: sve je odlučeno u trenutku kada je stablo struktura </w:t>
+      </w:r>
+      <w:r>
+        <w:rPr>
+          <w:rStyle w:val="VerbatimChar"/>
+        </w:rPr>
+        <w:t>AccessPath</w:t>
+      </w:r>
+      <w:r>
+        <w:t xml:space="preserve"> bilo gotovo, a posle toga se ono samo prevodi u objekte i pokreće.</w:t>
+      </w:r>
+    </w:p>
+    <w:p>
+      <w:pPr>
+        <w:pStyle w:val="BodyText"/>
+      </w:pPr>
+      <w:r>
+        <w:t xml:space="preserve">Model iteratora je i polazna tačka narednog poglavlja. Pošto svaki poziv metode </w:t>
+      </w:r>
+      <w:r>
+        <w:rPr>
+          <w:rStyle w:val="VerbatimChar"/>
+        </w:rPr>
+        <w:t>Read()</w:t>
+      </w:r>
+      <w:r>
+        <w:t xml:space="preserve"> vraća najviše jednu torku, tvrdnja da MySQL upite ne izvršava vektorizovano prestaje da bude izolovana činjenica i postaje posledica interfejsa opisanog ovde.</w:t>
+      </w:r>
+    </w:p>
+    <w:p>
+      <w:pPr>
+        <w:pStyle w:val="Heading1"/>
+      </w:pPr>
+      <w:bookmarkStart w:id="50" w:name="_Toc239095764"/>
+      <w:bookmarkStart w:id="51" w:name="gde-mysql-ne-prati-obrazac"/>
+      <w:bookmarkEnd w:id="39"/>
       <w:bookmarkEnd w:id="49"/>
+      <w:r>
+        <w:t>6. Gde MySQL ne prati obrazac</w:t>
+      </w:r>
+      <w:bookmarkEnd w:id="50"/>
     </w:p>
     <w:p>
       <w:pPr>
         <w:pStyle w:val="FirstParagraph"/>
       </w:pPr>
       <w:r>
-        <w:t xml:space="preserve">Ostaje pitanje odakle iteratori dolaze. Između planera iz poglavlja 3 i izvršioca stoji struktura </w:t>
-      </w:r>
-      <w:r>
-        <w:rPr>
-          <w:rStyle w:val="VerbatimChar"/>
-        </w:rPr>
-        <w:t>AccessPath</w:t>
-      </w:r>
-      <w:r>
-        <w:t xml:space="preserve">, koju izvorni kod opisuje kao strukturu planiranja upita koja iteratorima odgovara jedan prema jedan, jer sadrži gotovo tačno ono što je potrebno da se odgovarajući iterator instancira, uz podatke koji su potrebni samo tokom planiranja, kao što je cena [3]. Optimizator, dakle, ne pravi iteratore nego stablo struktura </w:t>
-      </w:r>
-      <w:r>
-        <w:rPr>
-          <w:rStyle w:val="VerbatimChar"/>
-        </w:rPr>
-        <w:t>AccessPath</w:t>
-      </w:r>
-      <w:r>
-        <w:t xml:space="preserve">, namerno malih i fiksne veličine, kako bi tokom pretrage jedna mogla da se zameni boljom bez nove alokacije; tek na kraju funkcija </w:t>
-      </w:r>
-      <w:r>
-        <w:rPr>
-          <w:rStyle w:val="VerbatimChar"/>
-        </w:rPr>
-        <w:t>CreateIteratorFromAccessPath()</w:t>
-      </w:r>
-      <w:r>
-        <w:t xml:space="preserve"> to stablo prevodi u stablo iteratora [3]. Strukturu </w:t>
-      </w:r>
-      <w:r>
-        <w:rPr>
-          <w:rStyle w:val="VerbatimChar"/>
-        </w:rPr>
-        <w:t>AccessPath</w:t>
-      </w:r>
-      <w:r>
-        <w:t xml:space="preserve"> ne treba mešati sa pristupnim putem iz poglavlja 1 i 3: prva je konkretna struktura u kodu, a drugi je pojam koji označava način na koji se dolazi do torki jedne tabele.</w:t>
-      </w:r>
-    </w:p>
-    <w:p>
-      <w:pPr>
-        <w:pStyle w:val="BodyText"/>
-      </w:pPr>
-      <w:r>
-        <w:t xml:space="preserve">Time se zatvara i pitanje otvoreno u odeljku 4.8, gde je u tragu optimizatora sav sadržaj bio u fazi </w:t>
-      </w:r>
-      <w:r>
-        <w:rPr>
-          <w:rStyle w:val="VerbatimChar"/>
-        </w:rPr>
-        <w:t>join_optimization</w:t>
-      </w:r>
-      <w:r>
-        <w:t xml:space="preserve">, dok je faza </w:t>
-      </w:r>
-      <w:r>
-        <w:rPr>
-          <w:rStyle w:val="VerbatimChar"/>
-        </w:rPr>
-        <w:t>join_execution</w:t>
-      </w:r>
-      <w:r>
-        <w:t xml:space="preserve"> bila prazna. Razlog je što se u izvršavanju ne donosi nijedna odluka koju bi trag imao da zabeleži: sve je odlučeno u trenutku kada je stablo struktura </w:t>
-      </w:r>
-      <w:r>
-        <w:rPr>
-          <w:rStyle w:val="VerbatimChar"/>
-        </w:rPr>
-        <w:t>AccessPath</w:t>
-      </w:r>
-      <w:r>
-        <w:t xml:space="preserve"> bilo gotovo, a posle toga se ono samo prevodi u objekte i pokreće.</w:t>
-      </w:r>
-    </w:p>
-    <w:p>
-      <w:pPr>
-        <w:pStyle w:val="BodyText"/>
-      </w:pPr>
-      <w:r>
-        <w:t xml:space="preserve">Model iteratora je i polazna tačka narednog poglavlja. Pošto svaki poziv metode </w:t>
-      </w:r>
-      <w:r>
-        <w:rPr>
-          <w:rStyle w:val="VerbatimChar"/>
-        </w:rPr>
-        <w:t>Read()</w:t>
-      </w:r>
-      <w:r>
-        <w:t xml:space="preserve"> vraća najviše jednu torku, tvrdnja da MySQL upite ne izvršava vektorizovano prestaje da bude izolovana činjenica i postaje posledica interfejsa opisanog ovde.</w:t>
-      </w:r>
-    </w:p>
-    <w:p>
-      <w:pPr>
-        <w:pStyle w:val="Heading1"/>
-      </w:pPr>
-      <w:bookmarkStart w:id="50" w:name="gde-mysql-ne-prati-obrazac"/>
-      <w:bookmarkStart w:id="51" w:name="_Toc239095764"/>
-      <w:bookmarkEnd w:id="38"/>
-      <w:bookmarkEnd w:id="48"/>
-      <w:r>
-        <w:t>6. Gde MySQL ne prati obrazac</w:t>
-      </w:r>
-      <w:bookmarkEnd w:id="51"/>
-    </w:p>
-    <w:p>
-      <w:pPr>
-        <w:pStyle w:val="FirstParagraph"/>
-      </w:pPr>
-      <w:r>
         <w:t>Prethodna poglavlja opisivala su šta MySQL radi. Ovo poglavlje skuplja na jedno mesto tri tvrdnje suprotnog oblika: MySQL ne izvršava upit nad paketima torki, ne paralelizuje izvršavanje plana i ne čuva izabrani plan za sledeće izvršenje. Odrična tvrdnja je slabija nego što izgleda, jer je obara jedan jedini protivprimer, pa se nijedan od tri odeljka ne zaustavlja na obliku „nema”, nego traži granicu na kojoj to „nema” prelazi u „ima, ali samo pod ovim uslovima”. Sve tri granice su izmerene na živom serveru.</w:t>
       </w:r>
     </w:p>
@@ -8083,12 +8073,12 @@
       <w:pPr>
         <w:pStyle w:val="Heading2"/>
       </w:pPr>
-      <w:bookmarkStart w:id="52" w:name="vektorizovano-izvršavanje"/>
-      <w:bookmarkStart w:id="53" w:name="_Toc239095765"/>
+      <w:bookmarkStart w:id="52" w:name="_Toc239095765"/>
+      <w:bookmarkStart w:id="53" w:name="vektorizovano-izvršavanje"/>
       <w:r>
         <w:t>6.1. Vektorizovano izvršavanje</w:t>
       </w:r>
-      <w:bookmarkEnd w:id="53"/>
+      <w:bookmarkEnd w:id="52"/>
     </w:p>
     <w:p>
       <w:pPr>
@@ -8201,13 +8191,13 @@
       <w:pPr>
         <w:pStyle w:val="Heading2"/>
       </w:pPr>
-      <w:bookmarkStart w:id="54" w:name="paralelno-izvršavanje-upita"/>
-      <w:bookmarkStart w:id="55" w:name="_Toc239095766"/>
-      <w:bookmarkEnd w:id="52"/>
+      <w:bookmarkStart w:id="54" w:name="_Toc239095766"/>
+      <w:bookmarkStart w:id="55" w:name="paralelno-izvršavanje-upita"/>
+      <w:bookmarkEnd w:id="53"/>
       <w:r>
         <w:t>6.2. Paralelno izvršavanje upita</w:t>
       </w:r>
-      <w:bookmarkEnd w:id="55"/>
+      <w:bookmarkEnd w:id="54"/>
     </w:p>
     <w:p>
       <w:pPr>
@@ -8510,13 +8500,13 @@
       <w:pPr>
         <w:pStyle w:val="Heading2"/>
       </w:pPr>
-      <w:bookmarkStart w:id="56" w:name="keširanje-i-ponovna-upotreba-planova"/>
-      <w:bookmarkStart w:id="57" w:name="_Toc239095767"/>
-      <w:bookmarkEnd w:id="54"/>
+      <w:bookmarkStart w:id="56" w:name="_Toc239095767"/>
+      <w:bookmarkStart w:id="57" w:name="keširanje-i-ponovna-upotreba-planova"/>
+      <w:bookmarkEnd w:id="55"/>
       <w:r>
         <w:t>6.3. Keširanje i ponovna upotreba planova</w:t>
       </w:r>
-      <w:bookmarkEnd w:id="57"/>
+      <w:bookmarkEnd w:id="56"/>
     </w:p>
     <w:p>
       <w:pPr>
@@ -8676,112 +8666,139 @@
       <w:pPr>
         <w:pStyle w:val="Heading1"/>
       </w:pPr>
-      <w:bookmarkStart w:id="58" w:name="zaključak"/>
-      <w:bookmarkStart w:id="59" w:name="_Toc239095768"/>
-      <w:bookmarkEnd w:id="50"/>
-      <w:bookmarkEnd w:id="56"/>
+      <w:bookmarkStart w:id="58" w:name="_Toc239095768"/>
+      <w:bookmarkStart w:id="59" w:name="zaključak"/>
+      <w:bookmarkEnd w:id="51"/>
+      <w:bookmarkEnd w:id="57"/>
       <w:r>
         <w:lastRenderedPageBreak/>
         <w:t>7. Zaključak</w:t>
       </w:r>
+      <w:bookmarkEnd w:id="58"/>
+    </w:p>
+    <w:p>
+      <w:pPr>
+        <w:pStyle w:val="FirstParagraph"/>
+      </w:pPr>
+      <w:r>
+        <w:t xml:space="preserve">Rad je pratio jednu nit: put deklarativnog SQL upita do njegovog fizičkog izvršenja u MySQL-u. Uvod je taj put postavio kao jaz koji se premošćuje optimizacijom na dva nivoa jednog istog problema, logičkom preformulacijom izraza i fizičkim izborom algoritma i pristupnog puta, a oba nivoa vodi isto merilo, cena [1]. Poglavlja koja slede daju tom opisu mehanizam: dvoslojnu arhitekturu sa šavom na klasi </w:t>
+      </w:r>
+      <w:r>
+        <w:rPr>
+          <w:rStyle w:val="VerbatimChar"/>
+        </w:rPr>
+        <w:t>handler</w:t>
+      </w:r>
+      <w:r>
+        <w:t>, pet faza obrade i liniju ispod koje svaku odluku sa alternativom rešava cena, ispis kojim se izabrani plan čini vidljivim i merenje kojim se procena proverava, i stablo iteratora u kome plan postaje kod koji se izvršava.</w:t>
+      </w:r>
+    </w:p>
+    <w:p>
+      <w:pPr>
+        <w:pStyle w:val="BodyText"/>
+      </w:pPr>
+      <w:r>
+        <w:t xml:space="preserve">Poglavlje 6 ostavlja sintezu: tri odrične tvrdnje iz njega nisu tri odvojene odluke nego jedna ista, viđena sa tri strane. Metoda </w:t>
+      </w:r>
+      <w:r>
+        <w:rPr>
+          <w:rStyle w:val="VerbatimChar"/>
+        </w:rPr>
+        <w:t>Read()</w:t>
+      </w:r>
+      <w:r>
+        <w:t xml:space="preserve"> po pozivu vraća najviše jednu torku, pa vektorizovanog izvršavanja nema. O predikatu odlučuje iterator na serverskom sloju, pa torke moraju da pređu granicu između dva sloja jedna po jedna i paralelnost staje na prvoj klauzuli </w:t>
+      </w:r>
+      <w:r>
+        <w:rPr>
+          <w:rStyle w:val="VerbatimChar"/>
+        </w:rPr>
+        <w:t>WHERE</w:t>
+      </w:r>
+      <w:r>
+        <w:t>. Optimizacija se obavlja nad stvarnom vrednošću parametra pri svakom izvršenju, pa nema plana koji bi se sačuvao i delio. MySQL, dakle, obradu upita drži usko vezanu za pojedinačnu torku i za pojedinačno izvršenje.</w:t>
+      </w:r>
+    </w:p>
+    <w:p>
+      <w:pPr>
+        <w:pStyle w:val="BodyText"/>
+      </w:pPr>
+      <w:r>
+        <w:t>Taj izbor nije propust nego kompromis. Izvršavanje torku po torku daje kratko vreme do prve torke i malu potrošnju memorije, optimizacija pri svakom izvršenju daje plan skrojen prema stvarnoj vrednosti parametra umesto generičkog, a paralelnost između konekcija ostavlja jezgra ostalim konekcijama: sve tri osobine odgovaraju transakcionom workloadu (OLTP). Cena se plaća kod upita koji prolaze kroz milione torki, gde se režija od približno 20 nanosekundi po torki po predikatu nema kroz šta raspodeliti, a paralelno čitanje se gubi čim se pojavi prvi predikat.</w:t>
+      </w:r>
+    </w:p>
+    <w:p>
+      <w:pPr>
+        <w:pStyle w:val="BodyText"/>
+      </w:pPr>
+      <w:r>
+        <w:t xml:space="preserve">Na tom suprotnom kraju drugi sistemi su otišli dalje. Vektorizovani izvršioci istu režiju raspodeljuju na paket torki [8], [9], PostgreSQL paralelizuje sam plan čvorom </w:t>
+      </w:r>
+      <w:r>
+        <w:rPr>
+          <w:rStyle w:val="VerbatimChar"/>
+        </w:rPr>
+        <w:t>Gather</w:t>
+      </w:r>
+      <w:r>
+        <w:t xml:space="preserve"> [12], a Oracle plan drži u deljenom pulu dostupnom svim sesijama [14]. Nijedan od njih, međutim, ne polazi sa drugog mesta: model iteratora koji MySQL zadržava jeste Volcano model [6], koji i vektorizovani izvršioci menjaju samo u jednoj tački, u broju torki po pozivu. Odgovor MySQL-a na analitički workload nije izmena tog izvršioca nego zaseban izvršilac pored njega [10].</w:t>
+      </w:r>
+    </w:p>
+    <w:p>
+      <w:pPr>
+        <w:pStyle w:val="BodyText"/>
+      </w:pPr>
+      <w:r>
+        <w:t xml:space="preserve">Ostaje i pouka o načinu na koji se o sistemu zaključuje. Ispis naredbe </w:t>
+      </w:r>
+      <w:r>
+        <w:rPr>
+          <w:rStyle w:val="VerbatimChar"/>
+        </w:rPr>
+        <w:t>EXPLAIN</w:t>
+      </w:r>
+      <w:r>
+        <w:t xml:space="preserve"> postaje dijagnoza tek uz merenje pored sebe, a razlika između 2,9 i 1,01 puta pokazuje da je i tvrdnja o tome šta sistem ne radi tačna samo uz uslove pod kojima je proverena. U narednim izdanjima očekivano se menja izbor plana, jer hipergrafski optimizator spoja u kodu verzije 8.4 već postoji, ali je pri prevođenju isključen [2]; model izvršavanja iz poglavlja </w:t>
+      </w:r>
+      <w:proofErr w:type="gramStart"/>
+      <w:r>
+        <w:t>5 time</w:t>
+      </w:r>
+      <w:proofErr w:type="gramEnd"/>
+      <w:r>
+        <w:t xml:space="preserve"> se ne </w:t>
+      </w:r>
+      <w:proofErr w:type="spellStart"/>
+      <w:r>
+        <w:t>menja</w:t>
+      </w:r>
+      <w:proofErr w:type="spellEnd"/>
+      <w:r>
+        <w:t>.</w:t>
+      </w:r>
+    </w:p>
+    <w:p>
+      <w:pPr>
+        <w:pStyle w:val="BodyText"/>
+      </w:pPr>
+    </w:p>
+    <w:p>
+      <w:pPr>
+        <w:pStyle w:val="BodyText"/>
+      </w:pPr>
+    </w:p>
+    <w:p>
+      <w:pPr>
+        <w:pStyle w:val="Heading1"/>
+      </w:pPr>
+      <w:bookmarkStart w:id="60" w:name="_Toc239095769"/>
+      <w:bookmarkStart w:id="61" w:name="reference"/>
       <w:bookmarkEnd w:id="59"/>
-    </w:p>
-    <w:p>
-      <w:pPr>
-        <w:pStyle w:val="FirstParagraph"/>
-      </w:pPr>
-      <w:r>
-        <w:t xml:space="preserve">Rad je pratio jednu nit: put deklarativnog SQL upita do njegovog fizičkog izvršenja u MySQL-u. Uvod je taj put postavio kao jaz koji se premošćuje optimizacijom na dva nivoa jednog istog problema, logičkom preformulacijom izraza i fizičkim izborom algoritma i pristupnog puta, a oba nivoa vodi isto merilo, cena [1]. Poglavlja koja slede daju tom opisu mehanizam: dvoslojnu arhitekturu sa šavom na klasi </w:t>
-      </w:r>
-      <w:r>
-        <w:rPr>
-          <w:rStyle w:val="VerbatimChar"/>
-        </w:rPr>
-        <w:t>handler</w:t>
-      </w:r>
-      <w:r>
-        <w:t>, pet faza obrade i liniju ispod koje svaku odluku sa alternativom rešava cena, ispis kojim se izabrani plan čini vidljivim i merenje kojim se procena proverava, i stablo iteratora u kome plan postaje kod koji se izvršava.</w:t>
-      </w:r>
-    </w:p>
-    <w:p>
-      <w:pPr>
-        <w:pStyle w:val="BodyText"/>
-      </w:pPr>
-      <w:r>
-        <w:t xml:space="preserve">Poglavlje 6 ostavlja sintezu: tri odrične tvrdnje iz njega nisu tri odvojene odluke nego jedna ista, viđena sa tri strane. Metoda </w:t>
-      </w:r>
-      <w:r>
-        <w:rPr>
-          <w:rStyle w:val="VerbatimChar"/>
-        </w:rPr>
-        <w:t>Read()</w:t>
-      </w:r>
-      <w:r>
-        <w:t xml:space="preserve"> po pozivu vraća najviše jednu torku, pa vektorizovanog izvršavanja nema. O predikatu odlučuje iterator na serverskom sloju, pa torke moraju da pređu granicu između dva sloja jedna po jedna i paralelnost staje na prvoj klauzuli </w:t>
-      </w:r>
-      <w:r>
-        <w:rPr>
-          <w:rStyle w:val="VerbatimChar"/>
-        </w:rPr>
-        <w:t>WHERE</w:t>
-      </w:r>
-      <w:r>
-        <w:t>. Optimizacija se obavlja nad stvarnom vrednošću parametra pri svakom izvršenju, pa nema plana koji bi se sačuvao i delio. MySQL, dakle, obradu upita drži usko vezanu za pojedinačnu torku i za pojedinačno izvršenje.</w:t>
-      </w:r>
-    </w:p>
-    <w:p>
-      <w:pPr>
-        <w:pStyle w:val="BodyText"/>
-      </w:pPr>
-      <w:r>
-        <w:t>Taj izbor nije propust nego kompromis. Izvršavanje torku po torku daje kratko vreme do prve torke i malu potrošnju memorije, optimizacija pri svakom izvršenju daje plan skrojen prema stvarnoj vrednosti parametra umesto generičkog, a paralelnost između konekcija ostavlja jezgra ostalim konekcijama: sve tri osobine odgovaraju transakcionom workloadu (OLTP). Cena se plaća kod upita koji prolaze kroz milione torki, gde se režija od približno 20 nanosekundi po torki po predikatu nema kroz šta raspodeliti, a paralelno čitanje se gubi čim se pojavi prvi predikat.</w:t>
-      </w:r>
-    </w:p>
-    <w:p>
-      <w:pPr>
-        <w:pStyle w:val="BodyText"/>
-      </w:pPr>
-      <w:r>
-        <w:t xml:space="preserve">Na tom suprotnom kraju drugi sistemi su otišli dalje. Vektorizovani izvršioci istu režiju raspodeljuju na paket torki [8], [9], PostgreSQL paralelizuje sam plan čvorom </w:t>
-      </w:r>
-      <w:r>
-        <w:rPr>
-          <w:rStyle w:val="VerbatimChar"/>
-        </w:rPr>
-        <w:t>Gather</w:t>
-      </w:r>
-      <w:r>
-        <w:t xml:space="preserve"> [12], a Oracle plan drži u deljenom pulu dostupnom svim sesijama [14]. Nijedan od njih, međutim, ne polazi sa drugog mesta: model iteratora koji MySQL zadržava jeste Volcano model [6], koji i vektorizovani izvršioci menjaju samo u jednoj tački, u broju torki po pozivu. Odgovor MySQL-a na analitički workload nije izmena tog izvršioca nego zaseban izvršilac pored njega [10].</w:t>
-      </w:r>
-    </w:p>
-    <w:p>
-      <w:pPr>
-        <w:pStyle w:val="BodyText"/>
-      </w:pPr>
-      <w:r>
-        <w:t xml:space="preserve">Ostaje i pouka o načinu na koji se o sistemu zaključuje. Ispis naredbe </w:t>
-      </w:r>
-      <w:r>
-        <w:rPr>
-          <w:rStyle w:val="VerbatimChar"/>
-        </w:rPr>
-        <w:t>EXPLAIN</w:t>
-      </w:r>
-      <w:r>
-        <w:t xml:space="preserve"> postaje dijagnoza tek uz merenje pored sebe, a razlika između 2,9 i 1,01 puta pokazuje da je i tvrdnja o tome šta sistem ne radi tačna samo uz uslove pod kojima je proverena. U narednim izdanjima očekivano se menja izbor plana, jer hipergrafski optimizator spoja u kodu verzije 8.4 već postoji, ali je pri prevođenju isključen [2]; model izvršavanja iz poglavlja 5 time se ne menja.</w:t>
-      </w:r>
-    </w:p>
-    <w:p>
-      <w:pPr>
-        <w:pStyle w:val="Heading1"/>
-      </w:pPr>
-      <w:bookmarkStart w:id="60" w:name="reference"/>
-      <w:bookmarkStart w:id="61" w:name="_Toc239095769"/>
-      <w:bookmarkEnd w:id="58"/>
-      <w:r>
+      <w:r>
+        <w:lastRenderedPageBreak/>
         <w:t>Reference</w:t>
       </w:r>
-      <w:bookmarkEnd w:id="61"/>
+      <w:bookmarkEnd w:id="60"/>
     </w:p>
     <w:p>
       <w:pPr>
@@ -8839,7 +8856,6 @@
       <w:bookmarkStart w:id="65" w:name="ref-mysqlsource84"/>
       <w:bookmarkEnd w:id="64"/>
       <w:r>
-        <w:lastRenderedPageBreak/>
         <w:t xml:space="preserve">[3] </w:t>
       </w:r>
       <w:r>
@@ -9141,7 +9157,7 @@
       <w:r>
         <w:t>.</w:t>
       </w:r>
-      <w:bookmarkEnd w:id="60"/>
+      <w:bookmarkEnd w:id="61"/>
       <w:bookmarkEnd w:id="63"/>
       <w:bookmarkEnd w:id="76"/>
     </w:p>

</xml_diff>